<commit_message>
fix: preserve centered/right alignment and fix double-percent in 3-JV docs
1. _justify_body_paragraphs: only apply JUSTIFY when paragraph has no
   explicit alignment (p.paragraph_format.alignment is None). Previously
   it overwrote explicit CENTER/RIGHT paragraphs (e.g. 'JOINT VENTURE
   AGREEMENT' title, JV name) making them left-aligned instead of centered.

2. master_template_3: removed literal % after {{L_PER}}/{{F_PER}}/{{S_PER}}
   placeholders. bid_compute.py already appends % to these values, so the
   template having its own % resulted in '40%%' in the generated document.

Co-Authored-By: Claude Sonnet 4.6 <noreply@anthropic.com>
</commit_message>
<xml_diff>
--- a/templates/master_template_3.docx
+++ b/templates/master_template_3.docx
@@ -1974,7 +1974,7 @@
           <w:sz w:val="20"/>
           <w:szCs w:val="20"/>
         </w:rPr>
-        <w:t>}}%</w:t>
+        <w:t>}}</w:t>
       </w:r>
       <w:proofErr w:type="gramEnd"/>
     </w:p>
@@ -2063,7 +2063,6 @@
           <w:sz w:val="20"/>
           <w:szCs w:val="20"/>
         </w:rPr>
-        <w:t>%</w:t>
       </w:r>
       <w:proofErr w:type="gramEnd"/>
     </w:p>
@@ -2170,7 +2169,6 @@
           <w:sz w:val="20"/>
           <w:szCs w:val="20"/>
         </w:rPr>
-        <w:t>%</w:t>
       </w:r>
       <w:proofErr w:type="gramEnd"/>
     </w:p>

</xml_diff>